<commit_message>
GLOB-1159: Enabled summary and detailed reports of accounting accounts for a selected cash register.
</commit_message>
<xml_diff>
--- a/Reportes/finiquito con acreedor hipotecario.docx
+++ b/Reportes/finiquito con acreedor hipotecario.docx
@@ -1,6 +1,6 @@
 
 <file path=word/document.xml><?xml version="1.0" encoding="utf-8"?>
-<w:document xmlns:wpc="http://schemas.microsoft.com/office/word/2010/wordprocessingCanvas" xmlns:cx="http://schemas.microsoft.com/office/drawing/2014/chartex" xmlns:cx1="http://schemas.microsoft.com/office/drawing/2015/9/8/chartex" xmlns:mc="http://schemas.openxmlformats.org/markup-compatibility/2006" xmlns:o="urn:schemas-microsoft-com:office:office" xmlns:r="http://schemas.openxmlformats.org/officeDocument/2006/relationships" xmlns:m="http://schemas.openxmlformats.org/officeDocument/2006/math" xmlns:v="urn:schemas-microsoft-com:vml" xmlns:wp14="http://schemas.microsoft.com/office/word/2010/wordprocessingDrawing" xmlns:wp="http://schemas.openxmlformats.org/drawingml/2006/wordprocessingDrawing" xmlns:w10="urn:schemas-microsoft-com:office:word" xmlns:w="http://schemas.openxmlformats.org/wordprocessingml/2006/main" xmlns:w14="http://schemas.microsoft.com/office/word/2010/wordml" xmlns:w15="http://schemas.microsoft.com/office/word/2012/wordml" xmlns:w16se="http://schemas.microsoft.com/office/word/2015/wordml/symex" xmlns:wpg="http://schemas.microsoft.com/office/word/2010/wordprocessingGroup" xmlns:wpi="http://schemas.microsoft.com/office/word/2010/wordprocessingInk" xmlns:wne="http://schemas.microsoft.com/office/word/2006/wordml" xmlns:wps="http://schemas.microsoft.com/office/word/2010/wordprocessingShape" mc:Ignorable="w14 w15 w16se wp14">
+<w:document xmlns:wpc="http://schemas.microsoft.com/office/word/2010/wordprocessingCanvas" xmlns:cx="http://schemas.microsoft.com/office/drawing/2014/chartex" xmlns:cx1="http://schemas.microsoft.com/office/drawing/2015/9/8/chartex" xmlns:cx2="http://schemas.microsoft.com/office/drawing/2015/10/21/chartex" xmlns:cx3="http://schemas.microsoft.com/office/drawing/2016/5/9/chartex" xmlns:cx4="http://schemas.microsoft.com/office/drawing/2016/5/10/chartex" xmlns:cx5="http://schemas.microsoft.com/office/drawing/2016/5/11/chartex" xmlns:cx6="http://schemas.microsoft.com/office/drawing/2016/5/12/chartex" xmlns:cx7="http://schemas.microsoft.com/office/drawing/2016/5/13/chartex" xmlns:cx8="http://schemas.microsoft.com/office/drawing/2016/5/14/chartex" xmlns:mc="http://schemas.openxmlformats.org/markup-compatibility/2006" xmlns:aink="http://schemas.microsoft.com/office/drawing/2016/ink" xmlns:am3d="http://schemas.microsoft.com/office/drawing/2017/model3d" xmlns:o="urn:schemas-microsoft-com:office:office" xmlns:oel="http://schemas.microsoft.com/office/2019/extlst" xmlns:r="http://schemas.openxmlformats.org/officeDocument/2006/relationships" xmlns:m="http://schemas.openxmlformats.org/officeDocument/2006/math" xmlns:v="urn:schemas-microsoft-com:vml" xmlns:wp14="http://schemas.microsoft.com/office/word/2010/wordprocessingDrawing" xmlns:wp="http://schemas.openxmlformats.org/drawingml/2006/wordprocessingDrawing" xmlns:w10="urn:schemas-microsoft-com:office:word" xmlns:w="http://schemas.openxmlformats.org/wordprocessingml/2006/main" xmlns:w14="http://schemas.microsoft.com/office/word/2010/wordml" xmlns:w15="http://schemas.microsoft.com/office/word/2012/wordml" xmlns:w16cex="http://schemas.microsoft.com/office/word/2018/wordml/cex" xmlns:w16cid="http://schemas.microsoft.com/office/word/2016/wordml/cid" xmlns:w16="http://schemas.microsoft.com/office/word/2018/wordml" xmlns:w16sdtdh="http://schemas.microsoft.com/office/word/2020/wordml/sdtdatahash" xmlns:w16se="http://schemas.microsoft.com/office/word/2015/wordml/symex" xmlns:wpg="http://schemas.microsoft.com/office/word/2010/wordprocessingGroup" xmlns:wpi="http://schemas.microsoft.com/office/word/2010/wordprocessingInk" xmlns:wne="http://schemas.microsoft.com/office/word/2006/wordml" xmlns:wps="http://schemas.microsoft.com/office/word/2010/wordprocessingShape" mc:Ignorable="w14 w15 w16se w16cid w16 w16cex w16sdtdh wp14">
   <w:body>
     <w:p>
       <w:pPr>
@@ -25,7 +25,7 @@
           <w:lang w:val="es-419" w:eastAsia="es-419"/>
         </w:rPr>
         <w:drawing>
-          <wp:inline distT="0" distB="0" distL="0" distR="0" wp14:anchorId="22E5E480" wp14:editId="687BD059">
+          <wp:inline distT="0" distB="0" distL="0" distR="0" wp14:anchorId="70D178E0" wp14:editId="2F171EB7">
             <wp:extent cx="2110740" cy="461010"/>
             <wp:effectExtent l="0" t="0" r="3810" b="0"/>
             <wp:docPr id="34531362" name="Imagen 6" descr="Imagen que contiene Logotipo&#10;&#10;El contenido generado por IA puede ser incorrecto."/>
@@ -270,8 +270,6 @@
         </w:rPr>
         <w:t>beneficiario</w:t>
       </w:r>
-      <w:bookmarkStart w:id="0" w:name="_GoBack"/>
-      <w:bookmarkEnd w:id="0"/>
       <w:proofErr w:type="spellEnd"/>
       <w:r>
         <w:rPr>
@@ -1074,148 +1072,294 @@
         <w:t xml:space="preserve"> </w:t>
       </w:r>
     </w:p>
+    <w:tbl>
+      <w:tblPr>
+        <w:tblStyle w:val="Tablaconcuadrcula"/>
+        <w:tblW w:w="0" w:type="auto"/>
+        <w:tblBorders>
+          <w:top w:val="none" w:sz="0" w:space="0" w:color="auto"/>
+          <w:left w:val="none" w:sz="0" w:space="0" w:color="auto"/>
+          <w:bottom w:val="none" w:sz="0" w:space="0" w:color="auto"/>
+          <w:right w:val="none" w:sz="0" w:space="0" w:color="auto"/>
+          <w:insideH w:val="none" w:sz="0" w:space="0" w:color="auto"/>
+          <w:insideV w:val="none" w:sz="0" w:space="0" w:color="auto"/>
+        </w:tblBorders>
+        <w:tblLook w:val="04A0" w:firstRow="1" w:lastRow="0" w:firstColumn="1" w:lastColumn="0" w:noHBand="0" w:noVBand="1"/>
+      </w:tblPr>
+      <w:tblGrid>
+        <w:gridCol w:w="1134"/>
+        <w:gridCol w:w="3112"/>
+        <w:gridCol w:w="716"/>
+        <w:gridCol w:w="3532"/>
+      </w:tblGrid>
+      <w:tr>
+        <w:tc>
+          <w:tcPr>
+            <w:tcW w:w="1134" w:type="dxa"/>
+          </w:tcPr>
+          <w:p>
+            <w:pPr>
+              <w:spacing w:line="360" w:lineRule="auto"/>
+              <w:jc w:val="both"/>
+              <w:rPr>
+                <w:b/>
+                <w:sz w:val="20"/>
+                <w:szCs w:val="20"/>
+              </w:rPr>
+            </w:pPr>
+            <w:r>
+              <w:rPr>
+                <w:b/>
+                <w:sz w:val="20"/>
+                <w:szCs w:val="20"/>
+              </w:rPr>
+              <w:t>CLIENTE</w:t>
+            </w:r>
+          </w:p>
+        </w:tc>
+        <w:tc>
+          <w:tcPr>
+            <w:tcW w:w="3112" w:type="dxa"/>
+          </w:tcPr>
+          <w:p>
+            <w:pPr>
+              <w:spacing w:line="360" w:lineRule="auto"/>
+              <w:jc w:val="both"/>
+              <w:rPr>
+                <w:b/>
+                <w:sz w:val="20"/>
+                <w:szCs w:val="20"/>
+              </w:rPr>
+            </w:pPr>
+          </w:p>
+        </w:tc>
+        <w:tc>
+          <w:tcPr>
+            <w:tcW w:w="4248" w:type="dxa"/>
+            <w:gridSpan w:val="2"/>
+          </w:tcPr>
+          <w:p>
+            <w:pPr>
+              <w:spacing w:line="360" w:lineRule="auto"/>
+              <w:jc w:val="both"/>
+              <w:rPr>
+                <w:b/>
+                <w:sz w:val="20"/>
+                <w:szCs w:val="20"/>
+              </w:rPr>
+            </w:pPr>
+            <w:r>
+              <w:rPr>
+                <w:b/>
+                <w:sz w:val="20"/>
+                <w:szCs w:val="20"/>
+              </w:rPr>
+              <w:t>ACREEDOR HIPOTECARIO</w:t>
+            </w:r>
+          </w:p>
+        </w:tc>
+      </w:tr>
+      <w:tr>
+        <w:tc>
+          <w:tcPr>
+            <w:tcW w:w="1134" w:type="dxa"/>
+          </w:tcPr>
+          <w:p>
+            <w:pPr>
+              <w:spacing w:line="360" w:lineRule="auto"/>
+              <w:jc w:val="both"/>
+              <w:rPr>
+                <w:b/>
+                <w:sz w:val="20"/>
+                <w:szCs w:val="20"/>
+              </w:rPr>
+            </w:pPr>
+            <w:r>
+              <w:rPr>
+                <w:sz w:val="20"/>
+                <w:szCs w:val="20"/>
+              </w:rPr>
+              <w:t>Firma</w:t>
+            </w:r>
+          </w:p>
+        </w:tc>
+        <w:tc>
+          <w:tcPr>
+            <w:tcW w:w="3112" w:type="dxa"/>
+          </w:tcPr>
+          <w:p>
+            <w:pPr>
+              <w:spacing w:line="360" w:lineRule="auto"/>
+              <w:jc w:val="both"/>
+              <w:rPr>
+                <w:b/>
+                <w:sz w:val="20"/>
+                <w:szCs w:val="20"/>
+              </w:rPr>
+            </w:pPr>
+            <w:r>
+              <w:rPr>
+                <w:b/>
+                <w:sz w:val="20"/>
+                <w:szCs w:val="20"/>
+              </w:rPr>
+              <w:t>_________________________</w:t>
+            </w:r>
+          </w:p>
+        </w:tc>
+        <w:tc>
+          <w:tcPr>
+            <w:tcW w:w="716" w:type="dxa"/>
+          </w:tcPr>
+          <w:p>
+            <w:pPr>
+              <w:spacing w:line="360" w:lineRule="auto"/>
+              <w:jc w:val="both"/>
+              <w:rPr>
+                <w:b/>
+                <w:sz w:val="20"/>
+                <w:szCs w:val="20"/>
+              </w:rPr>
+            </w:pPr>
+            <w:r>
+              <w:rPr>
+                <w:sz w:val="20"/>
+                <w:szCs w:val="20"/>
+              </w:rPr>
+              <w:t>Firma</w:t>
+            </w:r>
+          </w:p>
+        </w:tc>
+        <w:tc>
+          <w:tcPr>
+            <w:tcW w:w="3532" w:type="dxa"/>
+          </w:tcPr>
+          <w:p>
+            <w:pPr>
+              <w:spacing w:line="360" w:lineRule="auto"/>
+              <w:jc w:val="both"/>
+              <w:rPr>
+                <w:b/>
+                <w:sz w:val="20"/>
+                <w:szCs w:val="20"/>
+              </w:rPr>
+            </w:pPr>
+            <w:r>
+              <w:rPr>
+                <w:b/>
+                <w:sz w:val="20"/>
+                <w:szCs w:val="20"/>
+              </w:rPr>
+              <w:t>_________________________</w:t>
+            </w:r>
+          </w:p>
+        </w:tc>
+      </w:tr>
+      <w:tr>
+        <w:tc>
+          <w:tcPr>
+            <w:tcW w:w="1134" w:type="dxa"/>
+          </w:tcPr>
+          <w:p>
+            <w:pPr>
+              <w:spacing w:line="360" w:lineRule="auto"/>
+              <w:jc w:val="both"/>
+              <w:rPr>
+                <w:b/>
+                <w:sz w:val="20"/>
+                <w:szCs w:val="20"/>
+              </w:rPr>
+            </w:pPr>
+            <w:r>
+              <w:rPr>
+                <w:sz w:val="20"/>
+                <w:szCs w:val="20"/>
+              </w:rPr>
+              <w:t>Cedula No.</w:t>
+            </w:r>
+          </w:p>
+        </w:tc>
+        <w:tc>
+          <w:tcPr>
+            <w:tcW w:w="3112" w:type="dxa"/>
+          </w:tcPr>
+          <w:p>
+            <w:pPr>
+              <w:spacing w:line="360" w:lineRule="auto"/>
+              <w:jc w:val="both"/>
+              <w:rPr>
+                <w:b/>
+                <w:sz w:val="20"/>
+                <w:szCs w:val="20"/>
+              </w:rPr>
+            </w:pPr>
+            <w:r>
+              <w:rPr>
+                <w:b/>
+                <w:sz w:val="20"/>
+                <w:szCs w:val="20"/>
+              </w:rPr>
+              <w:t>_________________________</w:t>
+            </w:r>
+          </w:p>
+        </w:tc>
+        <w:tc>
+          <w:tcPr>
+            <w:tcW w:w="716" w:type="dxa"/>
+          </w:tcPr>
+          <w:p>
+            <w:pPr>
+              <w:spacing w:line="360" w:lineRule="auto"/>
+              <w:jc w:val="both"/>
+              <w:rPr>
+                <w:b/>
+                <w:sz w:val="20"/>
+                <w:szCs w:val="20"/>
+              </w:rPr>
+            </w:pPr>
+            <w:r>
+              <w:rPr>
+                <w:sz w:val="20"/>
+                <w:szCs w:val="20"/>
+              </w:rPr>
+              <w:t>Ruc.</w:t>
+            </w:r>
+          </w:p>
+        </w:tc>
+        <w:tc>
+          <w:tcPr>
+            <w:tcW w:w="3532" w:type="dxa"/>
+          </w:tcPr>
+          <w:p>
+            <w:pPr>
+              <w:spacing w:line="360" w:lineRule="auto"/>
+              <w:jc w:val="both"/>
+              <w:rPr>
+                <w:b/>
+                <w:sz w:val="20"/>
+                <w:szCs w:val="20"/>
+              </w:rPr>
+            </w:pPr>
+            <w:r>
+              <w:rPr>
+                <w:b/>
+                <w:sz w:val="20"/>
+                <w:szCs w:val="20"/>
+              </w:rPr>
+              <w:t>_________________________</w:t>
+            </w:r>
+          </w:p>
+        </w:tc>
+      </w:tr>
+    </w:tbl>
     <w:p>
       <w:pPr>
-        <w:spacing w:line="360" w:lineRule="auto"/>
-        <w:jc w:val="both"/>
-        <w:rPr>
-          <w:b/>
+        <w:pStyle w:val="Sinespaciado"/>
+        <w:rPr>
           <w:sz w:val="20"/>
           <w:szCs w:val="20"/>
         </w:rPr>
       </w:pPr>
-      <w:r>
-        <w:rPr>
-          <w:b/>
-          <w:sz w:val="20"/>
-          <w:szCs w:val="20"/>
-        </w:rPr>
-        <w:t>CLIENTE</w:t>
-      </w:r>
-      <w:r>
-        <w:rPr>
-          <w:b/>
-          <w:sz w:val="20"/>
-          <w:szCs w:val="20"/>
-        </w:rPr>
-        <w:tab/>
-      </w:r>
-      <w:r>
-        <w:rPr>
-          <w:sz w:val="20"/>
-          <w:szCs w:val="20"/>
-        </w:rPr>
-        <w:tab/>
-      </w:r>
-      <w:r>
-        <w:rPr>
-          <w:sz w:val="20"/>
-          <w:szCs w:val="20"/>
-        </w:rPr>
-        <w:tab/>
-      </w:r>
-      <w:r>
-        <w:rPr>
-          <w:sz w:val="20"/>
-          <w:szCs w:val="20"/>
-        </w:rPr>
-        <w:tab/>
-        <w:t xml:space="preserve">                       </w:t>
-      </w:r>
-      <w:r>
-        <w:rPr>
-          <w:b/>
-          <w:sz w:val="20"/>
-          <w:szCs w:val="20"/>
-        </w:rPr>
-        <w:t>ACREEDOR HIPOTECARIO</w:t>
-      </w:r>
-    </w:p>
-    <w:p>
-      <w:pPr>
-        <w:spacing w:line="360" w:lineRule="auto"/>
-        <w:jc w:val="both"/>
-        <w:rPr>
-          <w:sz w:val="20"/>
-          <w:szCs w:val="20"/>
-        </w:rPr>
-      </w:pPr>
-      <w:r>
-        <w:rPr>
-          <w:sz w:val="20"/>
-          <w:szCs w:val="20"/>
-        </w:rPr>
-        <w:t xml:space="preserve">Firma _______________________                         </w:t>
-      </w:r>
-      <w:r>
-        <w:rPr>
-          <w:sz w:val="20"/>
-          <w:szCs w:val="20"/>
-        </w:rPr>
-        <w:t xml:space="preserve">                  </w:t>
-      </w:r>
-      <w:r>
-        <w:rPr>
-          <w:sz w:val="20"/>
-          <w:szCs w:val="20"/>
-        </w:rPr>
-        <w:t xml:space="preserve"> </w:t>
-      </w:r>
-      <w:proofErr w:type="spellStart"/>
-      <w:r>
-        <w:rPr>
-          <w:sz w:val="20"/>
-          <w:szCs w:val="20"/>
-        </w:rPr>
-        <w:t>Firma</w:t>
-      </w:r>
-      <w:proofErr w:type="spellEnd"/>
-      <w:r>
-        <w:rPr>
-          <w:sz w:val="20"/>
-          <w:szCs w:val="20"/>
-        </w:rPr>
-        <w:t>__________________________</w:t>
-      </w:r>
-    </w:p>
-    <w:p>
-      <w:pPr>
-        <w:spacing w:line="360" w:lineRule="auto"/>
-        <w:jc w:val="both"/>
-        <w:rPr>
-          <w:sz w:val="20"/>
-          <w:szCs w:val="20"/>
-        </w:rPr>
-      </w:pPr>
-      <w:r>
-        <w:rPr>
-          <w:sz w:val="20"/>
-          <w:szCs w:val="20"/>
-        </w:rPr>
-        <w:t>Cedula No.___________________</w:t>
-      </w:r>
-      <w:r>
-        <w:rPr>
-          <w:sz w:val="20"/>
-          <w:szCs w:val="20"/>
-        </w:rPr>
-        <w:tab/>
-        <w:t xml:space="preserve">                          </w:t>
-      </w:r>
-      <w:r>
-        <w:rPr>
-          <w:sz w:val="20"/>
-          <w:szCs w:val="20"/>
-        </w:rPr>
-        <w:t xml:space="preserve">            </w:t>
-      </w:r>
-      <w:r>
-        <w:rPr>
-          <w:sz w:val="20"/>
-          <w:szCs w:val="20"/>
-        </w:rPr>
-        <w:t xml:space="preserve"> Ruc. __________________________</w:t>
-      </w:r>
     </w:p>
     <w:p>
       <w:pPr>
@@ -1433,7 +1577,7 @@
 </file>
 
 <file path=word/styles.xml><?xml version="1.0" encoding="utf-8"?>
-<w:styles xmlns:mc="http://schemas.openxmlformats.org/markup-compatibility/2006" xmlns:r="http://schemas.openxmlformats.org/officeDocument/2006/relationships" xmlns:w="http://schemas.openxmlformats.org/wordprocessingml/2006/main" xmlns:w14="http://schemas.microsoft.com/office/word/2010/wordml" xmlns:w15="http://schemas.microsoft.com/office/word/2012/wordml" xmlns:w16se="http://schemas.microsoft.com/office/word/2015/wordml/symex" mc:Ignorable="w14 w15 w16se">
+<w:styles xmlns:mc="http://schemas.openxmlformats.org/markup-compatibility/2006" xmlns:r="http://schemas.openxmlformats.org/officeDocument/2006/relationships" xmlns:w="http://schemas.openxmlformats.org/wordprocessingml/2006/main" xmlns:w14="http://schemas.microsoft.com/office/word/2010/wordml" xmlns:w15="http://schemas.microsoft.com/office/word/2012/wordml" xmlns:w16cex="http://schemas.microsoft.com/office/word/2018/wordml/cex" xmlns:w16cid="http://schemas.microsoft.com/office/word/2016/wordml/cid" xmlns:w16="http://schemas.microsoft.com/office/word/2018/wordml" xmlns:w16sdtdh="http://schemas.microsoft.com/office/word/2020/wordml/sdtdatahash" xmlns:w16se="http://schemas.microsoft.com/office/word/2015/wordml/symex" mc:Ignorable="w14 w15 w16se w16cid w16 w16cex w16sdtdh">
   <w:docDefaults>
     <w:rPrDefault>
       <w:rPr>
@@ -1449,7 +1593,7 @@
       </w:pPr>
     </w:pPrDefault>
   </w:docDefaults>
-  <w:latentStyles w:defLockedState="0" w:defUIPriority="99" w:defSemiHidden="0" w:defUnhideWhenUsed="0" w:defQFormat="0" w:count="371">
+  <w:latentStyles w:defLockedState="0" w:defUIPriority="99" w:defSemiHidden="0" w:defUnhideWhenUsed="0" w:defQFormat="0" w:count="376">
     <w:lsdException w:name="Normal" w:uiPriority="0" w:qFormat="1"/>
     <w:lsdException w:name="heading 1" w:uiPriority="9" w:qFormat="1"/>
     <w:lsdException w:name="heading 2" w:semiHidden="1" w:uiPriority="9" w:unhideWhenUsed="1" w:qFormat="1"/>
@@ -1555,7 +1699,6 @@
     <w:lsdException w:name="HTML Sample" w:semiHidden="1" w:unhideWhenUsed="1"/>
     <w:lsdException w:name="HTML Typewriter" w:semiHidden="1" w:unhideWhenUsed="1"/>
     <w:lsdException w:name="HTML Variable" w:semiHidden="1" w:unhideWhenUsed="1"/>
-    <w:lsdException w:name="Normal Table" w:semiHidden="1" w:unhideWhenUsed="1"/>
     <w:lsdException w:name="annotation subject" w:semiHidden="1" w:unhideWhenUsed="1"/>
     <w:lsdException w:name="No List" w:semiHidden="1" w:unhideWhenUsed="1"/>
     <w:lsdException w:name="Outline List 1" w:semiHidden="1" w:unhideWhenUsed="1"/>
@@ -1598,11 +1741,8 @@
     <w:lsdException w:name="Table Contemporary" w:semiHidden="1" w:unhideWhenUsed="1"/>
     <w:lsdException w:name="Table Elegant" w:semiHidden="1" w:unhideWhenUsed="1"/>
     <w:lsdException w:name="Table Professional" w:semiHidden="1" w:unhideWhenUsed="1"/>
-    <w:lsdException w:name="Table Subtle 1" w:semiHidden="1" w:unhideWhenUsed="1"/>
     <w:lsdException w:name="Table Subtle 2" w:semiHidden="1" w:unhideWhenUsed="1"/>
     <w:lsdException w:name="Table Web 1" w:semiHidden="1" w:unhideWhenUsed="1"/>
-    <w:lsdException w:name="Table Web 2" w:semiHidden="1" w:unhideWhenUsed="1"/>
-    <w:lsdException w:name="Table Web 3" w:semiHidden="1" w:unhideWhenUsed="1"/>
     <w:lsdException w:name="Balloon Text" w:semiHidden="1" w:unhideWhenUsed="1"/>
     <w:lsdException w:name="Table Grid" w:uiPriority="39"/>
     <w:lsdException w:name="Table Theme" w:semiHidden="1" w:unhideWhenUsed="1"/>
@@ -1821,6 +1961,11 @@
     <w:lsdException w:name="List Table 5 Dark Accent 6" w:uiPriority="50"/>
     <w:lsdException w:name="List Table 6 Colorful Accent 6" w:uiPriority="51"/>
     <w:lsdException w:name="List Table 7 Colorful Accent 6" w:uiPriority="52"/>
+    <w:lsdException w:name="Mention" w:semiHidden="1" w:unhideWhenUsed="1"/>
+    <w:lsdException w:name="Smart Hyperlink" w:semiHidden="1" w:unhideWhenUsed="1"/>
+    <w:lsdException w:name="Hashtag" w:semiHidden="1" w:unhideWhenUsed="1"/>
+    <w:lsdException w:name="Unresolved Mention" w:semiHidden="1" w:unhideWhenUsed="1"/>
+    <w:lsdException w:name="Smart Link" w:semiHidden="1" w:unhideWhenUsed="1"/>
   </w:latentStyles>
   <w:style w:type="paragraph" w:default="1" w:styleId="Normal">
     <w:name w:val="Normal"/>
@@ -1872,6 +2017,25 @@
       <w:lang w:val="es-PA"/>
       <w14:ligatures w14:val="standardContextual"/>
     </w:rPr>
+  </w:style>
+  <w:style w:type="table" w:styleId="Tablaconcuadrcula">
+    <w:name w:val="Table Grid"/>
+    <w:basedOn w:val="Tablanormal"/>
+    <w:uiPriority w:val="39"/>
+    <w:rsid w:val="00CE1017"/>
+    <w:pPr>
+      <w:spacing w:after="0" w:line="240" w:lineRule="auto"/>
+    </w:pPr>
+    <w:tblPr>
+      <w:tblBorders>
+        <w:top w:val="single" w:sz="4" w:space="0" w:color="auto"/>
+        <w:left w:val="single" w:sz="4" w:space="0" w:color="auto"/>
+        <w:bottom w:val="single" w:sz="4" w:space="0" w:color="auto"/>
+        <w:right w:val="single" w:sz="4" w:space="0" w:color="auto"/>
+        <w:insideH w:val="single" w:sz="4" w:space="0" w:color="auto"/>
+        <w:insideV w:val="single" w:sz="4" w:space="0" w:color="auto"/>
+      </w:tblBorders>
+    </w:tblPr>
   </w:style>
 </w:styles>
 </file>

</xml_diff>

<commit_message>
Ajustes pago de reclamos
</commit_message>
<xml_diff>
--- a/Reportes/finiquito con acreedor hipotecario.docx
+++ b/Reportes/finiquito con acreedor hipotecario.docx
@@ -182,18 +182,7 @@
           <w:sz w:val="20"/>
           <w:szCs w:val="20"/>
         </w:rPr>
-        <w:t>{</w:t>
-      </w:r>
-      <w:proofErr w:type="spellStart"/>
-      <w:proofErr w:type="gramStart"/>
-      <w:r>
-        <w:rPr>
-          <w:b/>
-          <w:bCs/>
-          <w:sz w:val="20"/>
-          <w:szCs w:val="20"/>
-        </w:rPr>
-        <w:t>custom.</w:t>
+        <w:t>{custom.</w:t>
       </w:r>
       <w:r>
         <w:rPr>
@@ -204,8 +193,6 @@
         </w:rPr>
         <w:t>beneficiario</w:t>
       </w:r>
-      <w:proofErr w:type="spellEnd"/>
-      <w:proofErr w:type="gramEnd"/>
       <w:r>
         <w:rPr>
           <w:b/>
@@ -247,19 +234,7 @@
           <w:szCs w:val="20"/>
           <w:u w:val="single"/>
         </w:rPr>
-        <w:t>{</w:t>
-      </w:r>
-      <w:proofErr w:type="spellStart"/>
-      <w:proofErr w:type="gramStart"/>
-      <w:r>
-        <w:rPr>
-          <w:b/>
-          <w:bCs/>
-          <w:sz w:val="20"/>
-          <w:szCs w:val="20"/>
-          <w:u w:val="single"/>
-        </w:rPr>
-        <w:t>custom.identificacion</w:t>
+        <w:t>{custom.identificacion</w:t>
       </w:r>
       <w:r>
         <w:rPr>
@@ -271,8 +246,6 @@
         </w:rPr>
         <w:t>beneficiario</w:t>
       </w:r>
-      <w:proofErr w:type="spellEnd"/>
-      <w:proofErr w:type="gramEnd"/>
       <w:r>
         <w:rPr>
           <w:b/>
@@ -315,27 +288,7 @@
           <w:szCs w:val="20"/>
           <w:u w:val="single"/>
         </w:rPr>
-        <w:t>{</w:t>
-      </w:r>
-      <w:proofErr w:type="spellStart"/>
-      <w:r>
-        <w:rPr>
-          <w:b/>
-          <w:sz w:val="20"/>
-          <w:szCs w:val="20"/>
-          <w:u w:val="single"/>
-        </w:rPr>
-        <w:t>custom.acreedor</w:t>
-      </w:r>
-      <w:proofErr w:type="spellEnd"/>
-      <w:r>
-        <w:rPr>
-          <w:b/>
-          <w:sz w:val="20"/>
-          <w:szCs w:val="20"/>
-          <w:u w:val="single"/>
-        </w:rPr>
-        <w:t>}</w:t>
+        <w:t>{custom.acreedor}</w:t>
       </w:r>
       <w:r>
         <w:rPr>
@@ -386,33 +339,7 @@
           <w:szCs w:val="20"/>
           <w:u w:val="single"/>
         </w:rPr>
-        <w:t>{</w:t>
-      </w:r>
-      <w:proofErr w:type="spellStart"/>
-      <w:proofErr w:type="gramStart"/>
-      <w:r>
-        <w:rPr>
-          <w:rFonts w:ascii="Arial" w:hAnsi="Arial" w:cs="Arial"/>
-          <w:b/>
-          <w:bCs/>
-          <w:sz w:val="20"/>
-          <w:szCs w:val="20"/>
-          <w:u w:val="single"/>
-        </w:rPr>
-        <w:t>custom.identificacionacreedor</w:t>
-      </w:r>
-      <w:proofErr w:type="spellEnd"/>
-      <w:proofErr w:type="gramEnd"/>
-      <w:r>
-        <w:rPr>
-          <w:rFonts w:ascii="Arial" w:hAnsi="Arial" w:cs="Arial"/>
-          <w:b/>
-          <w:bCs/>
-          <w:sz w:val="20"/>
-          <w:szCs w:val="20"/>
-          <w:u w:val="single"/>
-        </w:rPr>
-        <w:t>}</w:t>
+        <w:t>{custom.identificacionacreedor}</w:t>
       </w:r>
       <w:r>
         <w:rPr>
@@ -462,31 +389,7 @@
           <w:szCs w:val="20"/>
           <w:u w:val="single"/>
         </w:rPr>
-        <w:t>{</w:t>
-      </w:r>
-      <w:proofErr w:type="spellStart"/>
-      <w:proofErr w:type="gramStart"/>
-      <w:r>
-        <w:rPr>
-          <w:b/>
-          <w:bCs/>
-          <w:sz w:val="20"/>
-          <w:szCs w:val="20"/>
-          <w:u w:val="single"/>
-        </w:rPr>
-        <w:t>custom.total</w:t>
-      </w:r>
-      <w:proofErr w:type="spellEnd"/>
-      <w:proofErr w:type="gramEnd"/>
-      <w:r>
-        <w:rPr>
-          <w:b/>
-          <w:bCs/>
-          <w:sz w:val="20"/>
-          <w:szCs w:val="20"/>
-          <w:u w:val="single"/>
-        </w:rPr>
-        <w:t>}</w:t>
+        <w:t>{custom.total}</w:t>
       </w:r>
       <w:r>
         <w:rPr>
@@ -504,18 +407,7 @@
           <w:szCs w:val="20"/>
           <w:u w:val="single"/>
         </w:rPr>
-        <w:t>{</w:t>
-      </w:r>
-      <w:proofErr w:type="spellStart"/>
-      <w:r>
-        <w:rPr>
-          <w:b/>
-          <w:bCs/>
-          <w:sz w:val="20"/>
-          <w:szCs w:val="20"/>
-          <w:u w:val="single"/>
-        </w:rPr>
-        <w:t>custom.</w:t>
+        <w:t>{custom.</w:t>
       </w:r>
       <w:r>
         <w:rPr>
@@ -535,18 +427,7 @@
           <w:szCs w:val="20"/>
           <w:u w:val="single"/>
         </w:rPr>
-        <w:t>letras</w:t>
-      </w:r>
-      <w:proofErr w:type="spellEnd"/>
-      <w:r>
-        <w:rPr>
-          <w:b/>
-          <w:bCs/>
-          <w:sz w:val="20"/>
-          <w:szCs w:val="20"/>
-          <w:u w:val="single"/>
-        </w:rPr>
-        <w:t>}</w:t>
+        <w:t>letras}</w:t>
       </w:r>
       <w:r>
         <w:rPr>
@@ -569,25 +450,7 @@
           <w:szCs w:val="20"/>
           <w:u w:val="single"/>
         </w:rPr>
-        <w:t>{</w:t>
-      </w:r>
-      <w:proofErr w:type="spellStart"/>
-      <w:r>
-        <w:rPr>
-          <w:sz w:val="20"/>
-          <w:szCs w:val="20"/>
-          <w:u w:val="single"/>
-        </w:rPr>
-        <w:t>custom.totaledificio</w:t>
-      </w:r>
-      <w:proofErr w:type="spellEnd"/>
-      <w:r>
-        <w:rPr>
-          <w:sz w:val="20"/>
-          <w:szCs w:val="20"/>
-          <w:u w:val="single"/>
-        </w:rPr>
-        <w:t>}</w:t>
+        <w:t>{custom.totaledificio}</w:t>
       </w:r>
       <w:r>
         <w:rPr>
@@ -610,27 +473,7 @@
           <w:szCs w:val="20"/>
           <w:u w:val="single"/>
         </w:rPr>
-        <w:t>{</w:t>
-      </w:r>
-      <w:proofErr w:type="spellStart"/>
-      <w:proofErr w:type="gramStart"/>
-      <w:r>
-        <w:rPr>
-          <w:sz w:val="20"/>
-          <w:szCs w:val="20"/>
-          <w:u w:val="single"/>
-        </w:rPr>
-        <w:t>custom.totalcontenido</w:t>
-      </w:r>
-      <w:proofErr w:type="spellEnd"/>
-      <w:proofErr w:type="gramEnd"/>
-      <w:r>
-        <w:rPr>
-          <w:sz w:val="20"/>
-          <w:szCs w:val="20"/>
-          <w:u w:val="single"/>
-        </w:rPr>
-        <w:t>}</w:t>
+        <w:t>{custom.totalcontenido}</w:t>
       </w:r>
       <w:r>
         <w:rPr>
@@ -670,27 +513,30 @@
           <w:sz w:val="20"/>
           <w:szCs w:val="20"/>
         </w:rPr>
-        <w:t xml:space="preserve">., en concepto de pago por indemnización total y definitiva de todos nuestros derechos de reclamación por Siniestro de Incendio ocasionado en </w:t>
-      </w:r>
-      <w:r>
-        <w:rPr>
-          <w:b/>
-          <w:bCs/>
-          <w:sz w:val="20"/>
-          <w:szCs w:val="20"/>
-        </w:rPr>
-        <w:t>{</w:t>
-      </w:r>
-      <w:proofErr w:type="spellStart"/>
-      <w:proofErr w:type="gramStart"/>
-      <w:r>
-        <w:rPr>
-          <w:b/>
-          <w:bCs/>
-          <w:sz w:val="20"/>
-          <w:szCs w:val="20"/>
-        </w:rPr>
-        <w:t>custom.</w:t>
+        <w:t xml:space="preserve">., en concepto de pago por indemnización total y definitiva de todos nuestros derechos de reclamación por Siniestro de Incendio </w:t>
+      </w:r>
+      <w:r>
+        <w:rPr>
+          <w:sz w:val="20"/>
+          <w:szCs w:val="20"/>
+        </w:rPr>
+        <w:t>ocurrido</w:t>
+      </w:r>
+      <w:r>
+        <w:rPr>
+          <w:sz w:val="20"/>
+          <w:szCs w:val="20"/>
+        </w:rPr>
+        <w:t xml:space="preserve"> en </w:t>
+      </w:r>
+      <w:r>
+        <w:rPr>
+          <w:b/>
+          <w:bCs/>
+          <w:sz w:val="20"/>
+          <w:szCs w:val="20"/>
+        </w:rPr>
+        <w:t>{custom.</w:t>
       </w:r>
       <w:r>
         <w:rPr>
@@ -701,8 +547,6 @@
         </w:rPr>
         <w:t>descripcionSiniestro</w:t>
       </w:r>
-      <w:proofErr w:type="spellEnd"/>
-      <w:proofErr w:type="gramEnd"/>
       <w:r>
         <w:rPr>
           <w:b/>
@@ -736,29 +580,7 @@
           <w:szCs w:val="20"/>
           <w:u w:val="single"/>
         </w:rPr>
-        <w:t>{</w:t>
-      </w:r>
-      <w:proofErr w:type="spellStart"/>
-      <w:r>
-        <w:rPr>
-          <w:b/>
-          <w:bCs/>
-          <w:sz w:val="20"/>
-          <w:szCs w:val="20"/>
-          <w:u w:val="single"/>
-        </w:rPr>
-        <w:t>custom.fechaletras</w:t>
-      </w:r>
-      <w:proofErr w:type="spellEnd"/>
-      <w:r>
-        <w:rPr>
-          <w:b/>
-          <w:bCs/>
-          <w:sz w:val="20"/>
-          <w:szCs w:val="20"/>
-          <w:u w:val="single"/>
-        </w:rPr>
-        <w:t>}</w:t>
+        <w:t>{custom.fechaletras}</w:t>
       </w:r>
       <w:r>
         <w:rPr>
@@ -783,29 +605,7 @@
           <w:szCs w:val="20"/>
           <w:u w:val="single"/>
         </w:rPr>
-        <w:t>{</w:t>
-      </w:r>
-      <w:proofErr w:type="spellStart"/>
-      <w:proofErr w:type="gramStart"/>
-      <w:r>
-        <w:rPr>
-          <w:b/>
-          <w:sz w:val="20"/>
-          <w:szCs w:val="20"/>
-          <w:u w:val="single"/>
-        </w:rPr>
-        <w:t>custom.poliza</w:t>
-      </w:r>
-      <w:proofErr w:type="spellEnd"/>
-      <w:proofErr w:type="gramEnd"/>
-      <w:r>
-        <w:rPr>
-          <w:b/>
-          <w:sz w:val="20"/>
-          <w:szCs w:val="20"/>
-          <w:u w:val="single"/>
-        </w:rPr>
-        <w:t>}</w:t>
+        <w:t>{custom.poliza}</w:t>
       </w:r>
     </w:p>
     <w:p>
@@ -1199,48 +999,17 @@
           <w:sz w:val="20"/>
           <w:szCs w:val="20"/>
         </w:rPr>
-        <w:t>Asegurado</w:t>
-      </w:r>
-      <w:proofErr w:type="gramStart"/>
-      <w:r>
-        <w:rPr>
-          <w:sz w:val="20"/>
-          <w:szCs w:val="20"/>
-        </w:rPr>
-        <w:t xml:space="preserve">:  </w:t>
-      </w:r>
-      <w:r>
-        <w:rPr>
-          <w:b/>
-          <w:bCs/>
-          <w:sz w:val="20"/>
-          <w:szCs w:val="20"/>
-          <w:u w:val="single"/>
-        </w:rPr>
-        <w:t>{</w:t>
-      </w:r>
-      <w:proofErr w:type="spellStart"/>
-      <w:proofErr w:type="gramEnd"/>
-      <w:r>
-        <w:rPr>
-          <w:b/>
-          <w:bCs/>
-          <w:sz w:val="20"/>
-          <w:szCs w:val="20"/>
-          <w:u w:val="single"/>
-        </w:rPr>
-        <w:t>custom.asegurado</w:t>
-      </w:r>
-      <w:proofErr w:type="spellEnd"/>
-      <w:r>
-        <w:rPr>
-          <w:b/>
-          <w:bCs/>
-          <w:sz w:val="20"/>
-          <w:szCs w:val="20"/>
-          <w:u w:val="single"/>
-        </w:rPr>
-        <w:t>}</w:t>
+        <w:t xml:space="preserve">Asegurado:  </w:t>
+      </w:r>
+      <w:r>
+        <w:rPr>
+          <w:b/>
+          <w:bCs/>
+          <w:sz w:val="20"/>
+          <w:szCs w:val="20"/>
+          <w:u w:val="single"/>
+        </w:rPr>
+        <w:t>{custom.asegurado}</w:t>
       </w:r>
     </w:p>
     <w:p>
@@ -1259,48 +1028,17 @@
           <w:sz w:val="20"/>
           <w:szCs w:val="20"/>
         </w:rPr>
-        <w:t xml:space="preserve">Reclamo:   </w:t>
-      </w:r>
-      <w:proofErr w:type="gramStart"/>
-      <w:r>
-        <w:rPr>
-          <w:sz w:val="20"/>
-          <w:szCs w:val="20"/>
-        </w:rPr>
-        <w:t xml:space="preserve">   </w:t>
-      </w:r>
-      <w:r>
-        <w:rPr>
-          <w:b/>
-          <w:bCs/>
-          <w:sz w:val="20"/>
-          <w:szCs w:val="20"/>
-          <w:u w:val="single"/>
-        </w:rPr>
-        <w:t>{</w:t>
-      </w:r>
-      <w:proofErr w:type="spellStart"/>
-      <w:proofErr w:type="gramEnd"/>
-      <w:r>
-        <w:rPr>
-          <w:b/>
-          <w:bCs/>
-          <w:sz w:val="20"/>
-          <w:szCs w:val="20"/>
-          <w:u w:val="single"/>
-        </w:rPr>
-        <w:t>custom.reclamo</w:t>
-      </w:r>
-      <w:proofErr w:type="spellEnd"/>
-      <w:r>
-        <w:rPr>
-          <w:b/>
-          <w:bCs/>
-          <w:sz w:val="20"/>
-          <w:szCs w:val="20"/>
-          <w:u w:val="single"/>
-        </w:rPr>
-        <w:t>}</w:t>
+        <w:t xml:space="preserve">Reclamo:      </w:t>
+      </w:r>
+      <w:r>
+        <w:rPr>
+          <w:b/>
+          <w:bCs/>
+          <w:sz w:val="20"/>
+          <w:szCs w:val="20"/>
+          <w:u w:val="single"/>
+        </w:rPr>
+        <w:t>{custom.reclamo}</w:t>
       </w:r>
     </w:p>
     <w:p>
@@ -1328,18 +1066,7 @@
           <w:sz w:val="20"/>
           <w:szCs w:val="20"/>
         </w:rPr>
-        <w:t>{</w:t>
-      </w:r>
-      <w:proofErr w:type="spellStart"/>
-      <w:proofErr w:type="gramStart"/>
-      <w:r>
-        <w:rPr>
-          <w:b/>
-          <w:bCs/>
-          <w:sz w:val="20"/>
-          <w:szCs w:val="20"/>
-        </w:rPr>
-        <w:t>custom.cheque</w:t>
+        <w:t>{custom.cheque</w:t>
       </w:r>
       <w:r>
         <w:rPr>
@@ -1350,8 +1077,6 @@
         </w:rPr>
         <w:t>total</w:t>
       </w:r>
-      <w:proofErr w:type="spellEnd"/>
-      <w:proofErr w:type="gramEnd"/>
       <w:r>
         <w:rPr>
           <w:b/>

</xml_diff>

<commit_message>
Ajustes reportes de finiquitos y solicitud de pago
</commit_message>
<xml_diff>
--- a/Reportes/finiquito con acreedor hipotecario.docx
+++ b/Reportes/finiquito con acreedor hipotecario.docx
@@ -570,7 +570,35 @@
           <w:sz w:val="20"/>
           <w:szCs w:val="20"/>
         </w:rPr>
-        <w:t xml:space="preserve">concernientes al siniestro ocurrido el día </w:t>
+        <w:t xml:space="preserve">concernientes al </w:t>
+      </w:r>
+      <w:r>
+        <w:rPr>
+          <w:sz w:val="20"/>
+          <w:szCs w:val="20"/>
+        </w:rPr>
+        <w:t>incidente</w:t>
+      </w:r>
+      <w:r>
+        <w:rPr>
+          <w:sz w:val="20"/>
+          <w:szCs w:val="20"/>
+        </w:rPr>
+        <w:t xml:space="preserve"> </w:t>
+      </w:r>
+      <w:r>
+        <w:rPr>
+          <w:sz w:val="20"/>
+          <w:szCs w:val="20"/>
+        </w:rPr>
+        <w:t>originado</w:t>
+      </w:r>
+      <w:r>
+        <w:rPr>
+          <w:sz w:val="20"/>
+          <w:szCs w:val="20"/>
+        </w:rPr>
+        <w:t xml:space="preserve"> el día </w:t>
       </w:r>
       <w:r>
         <w:rPr>

</xml_diff>